<commit_message>
Jojo Bizzare Part 2 Opening
</commit_message>
<xml_diff>
--- a/Makalah_Watson.docx
+++ b/Makalah_Watson.docx
@@ -2822,23 +2822,7 @@
           <w:iCs w:val="0"/>
           <w:highlight w:val="none"/>
         </w:rPr>
-        <w:t xml:space="preserve">Bagaimana perkembangan keamanan data dan informasi dalam era perkembangan teknologi AI dan </w:t>
-      </w:r>
-      <w:r>
-        <w:rPr>
-          <w:i/>
-          <w:iCs/>
-          <w:highlight w:val="none"/>
-        </w:rPr>
-        <w:t xml:space="preserve">Quantum Computing</w:t>
-      </w:r>
-      <w:r>
-        <w:rPr>
-          <w:i w:val="0"/>
-          <w:iCs w:val="0"/>
-          <w:highlight w:val="none"/>
-        </w:rPr>
-        <w:t xml:space="preserve">.</w:t>
+        <w:t xml:space="preserve">Bagaimana perkembangan teknologi mempengaruhi keamanan data dan informasi.</w:t>
       </w:r>
       <w:r/>
     </w:p>
@@ -3245,6 +3229,11 @@
           <w:highlight w:val="none"/>
         </w:rPr>
       </w:r>
+      <w:r>
+        <w:rPr>
+          <w:highlight w:val="none"/>
+        </w:rPr>
+      </w:r>
     </w:p>
     <w:p>
       <w:pPr>
@@ -3271,7 +3260,18 @@
         <w:rPr>
           <w:highlight w:val="none"/>
         </w:rPr>
-        <w:t xml:space="preserve">kode berbahaya pada form input suatu website menggunakan kode javascript yang kemudian akan diproses oleh website, karena kode berbahaya tersebut sudah menjadi bagian dari website tersebut, maka kode dari penyerang dapat dijalankan oleh pengguna website lainya. XSS terjadi karena tidak ada validasi form input pada website yang memiliki kerentanan XSS.</w:t>
+        <w:t xml:space="preserve">kode berbahaya pada form input suatu website menggunakan kode javascript yang kemudian akan dipro</w:t>
+      </w:r>
+      <w:r>
+        <w:rPr>
+          <w:highlight w:val="none"/>
+        </w:rPr>
+        <w:t xml:space="preserve">ses oleh website, karena kode berbahaya tersebut sudah menjadi bagian dari website tersebut, maka kode dari penyerang dapat dijalankan oleh pengguna website lainya. XSS terjadi karena tidak ada validasi form input pada website yang memiliki kerentanan XSS.</w:t>
+      </w:r>
+      <w:r>
+        <w:rPr>
+          <w:highlight w:val="none"/>
+        </w:rPr>
       </w:r>
       <w:r>
         <w:rPr>
@@ -3304,7 +3304,18 @@
         <w:rPr>
           <w:highlight w:val="none"/>
         </w:rPr>
-        <w:t xml:space="preserve">berbahaya pada url website dan akan menjalankan kodenya ketika url berbaya tersebut dimuat. DOM Based XSS menyimpan kode berbahaya pada browser  </w:t>
+        <w:t xml:space="preserve">berbahaya pada url website dan akan menjalankan kodenya ketika url berbaya tersebut dimuat. DOM Based XSS menyimpan kode berbahaya pada </w:t>
+      </w:r>
+      <w:r>
+        <w:rPr>
+          <w:highlight w:val="none"/>
+        </w:rPr>
+        <w:t xml:space="preserve">client side sehingga sulit terdeteksi oleh server.</w:t>
+      </w:r>
+      <w:r>
+        <w:rPr>
+          <w:highlight w:val="none"/>
+        </w:rPr>
       </w:r>
       <w:r>
         <w:rPr>
@@ -3361,7 +3372,6 @@
         </w:rPr>
         <w:t xml:space="preserve">arkan melalui tautan berbahaya yang dibagikan di grup WhatsApp mahasiswa.</w:t>
       </w:r>
-      <w:r/>
       <w:r/>
     </w:p>
     <w:p>
@@ -3483,6 +3493,13 @@
           <w:highlight w:val="none"/>
         </w:rPr>
       </w:r>
+      <w:r>
+        <w:rPr>
+          <w:bCs w:val="0"/>
+          <w:i w:val="0"/>
+          <w:highlight w:val="none"/>
+        </w:rPr>
+      </w:r>
     </w:p>
     <w:p>
       <w:pPr>
@@ -3501,12 +3518,33 @@
           <w:iCs w:val="0"/>
           <w:highlight w:val="none"/>
         </w:rPr>
-        <w:t xml:space="preserve">Penyerang social engineering melaksanakan seranganya dengan berpura-pura menjadi orang yang dekat dengan korbanya seperti keluarga, teman, rekan kerja, dan lain-lain. Kemudian setelah mendapatkan kepercayaan korban, pelaku umumnya mengirimkan  file atau link yang perlu dibuka oleh korbanya yang kemudian akan </w:t>
+        <w:t xml:space="preserve">Penyerang social engineering melaksanakan seranganya d</w:t>
+      </w:r>
+      <w:r>
+        <w:rPr>
+          <w:i w:val="0"/>
+          <w:iCs w:val="0"/>
+          <w:highlight w:val="none"/>
+        </w:rPr>
+        <w:t xml:space="preserve">engan berpura-pura menjadi orang yang dekat dengan korbanya seperti keluarga, teman, rekan kerja, dan lain-lain. Kemudian setelah mendapatkan kepercayaan korban, pelaku umumnya mengirimkan  file atau link yang perlu dibuka oleh korbanya yang kemudian akan </w:t>
       </w:r>
       <w:r>
         <w:t xml:space="preserve">menjalankan program berbahaya (malware) pada perangkat komputer korban</w:t>
       </w:r>
-      <w:r/>
+      <w:r>
+        <w:rPr>
+          <w:bCs w:val="0"/>
+          <w:i w:val="0"/>
+          <w:highlight w:val="none"/>
+        </w:rPr>
+      </w:r>
+      <w:r>
+        <w:rPr>
+          <w:bCs w:val="0"/>
+          <w:i w:val="0"/>
+          <w:highlight w:val="none"/>
+        </w:rPr>
+      </w:r>
     </w:p>
     <w:p>
       <w:pPr>
@@ -3563,7 +3601,6 @@
         </w:rPr>
         <w:t xml:space="preserve">elalui voice phishing (panggilan telepon penipuan) dan perangkat lunak pemerasan juga tersebar luas, 60% insiden keamanan informasi di seluruh negeri disebabkan oleh manipulasi semacam itu.</w:t>
       </w:r>
-      <w:r/>
       <w:r/>
     </w:p>
     <w:p>
@@ -3679,8 +3716,16 @@
       <w:r>
         <w:t xml:space="preserve">erangan SQL injection memanfaatkan kerentanan dalam validasi input pada aplikasi web untuk menyisipkan perintah SQL berbahaya, yang berpotensi mengakibatkan data basis data diekstraksi, dimanipulasi, atau dihapus. </w:t>
       </w:r>
-      <w:r/>
-      <w:r/>
+      <w:r>
+        <w:rPr>
+          <w:highlight w:val="none"/>
+        </w:rPr>
+      </w:r>
+      <w:r>
+        <w:rPr>
+          <w:highlight w:val="none"/>
+        </w:rPr>
+      </w:r>
     </w:p>
     <w:p>
       <w:pPr>
@@ -3712,6 +3757,7 @@
           <w:highlight w:val="none"/>
         </w:rPr>
       </w:r>
+      <w:r/>
     </w:p>
     <w:p>
       <w:pPr>
@@ -3742,7 +3788,6 @@
         <w:t xml:space="preserve">melalui SQLMap, dengan teknik berbasis waktu (SLEEP(5)) dan boolean (AND 1=1--). Jurnal SMATIKA Ubhinus (2024) memvalidasi pengujian penetrasi dan mengidentifikasi 92% kerentanan dalam aplikasi PHP+MySQL sebelum implementasi.</w:t>
       </w:r>
       <w:r/>
-      <w:r/>
     </w:p>
     <w:p>
       <w:pPr>
@@ -3811,7 +3856,10 @@
         <w:t xml:space="preserve">nial of Service) adal</w:t>
       </w:r>
       <w:r>
-        <w:t xml:space="preserve">ah serangan yang mengganggu ketersediaan layanan dengan membanjiri infrastruktur target menggunakan arus data jaringan seperti menggunakan bot untuk , yang mengakibatkan kegagalan sistem dan gangguan operasional. DoS dan DDoS berbeda pada tujuan seranganya dimana DoS digunakan untuk menyerang satu alamat IP sedangkan</w:t>
+        <w:t xml:space="preserve">ah serangan yang mengganggu ketersediaan layanan dengan memban</w:t>
+      </w:r>
+      <w:r>
+        <w:t xml:space="preserve">jiri infrastruktur target menggunakan arus data jaringan seperti menggunakan bot untuk , yang mengakibatkan kegagalan sistem dan gangguan operasional. DoS dan DDoS berbeda pada tujuan seranganya dimana DoS digunakan untuk menyerang satu alamat IP sedangkan</w:t>
       </w:r>
       <w:r>
         <w:t xml:space="preserve"> DDoS digunakan untuk menyerang ke beberapa alamat sekaligus.</w:t>
@@ -3844,7 +3892,6 @@
         <w:t xml:space="preserve">S, 12; threshold: type both, track by_dst, count 100, seconds 10;). Serangan DDoS berbasis lalu lintas melalui botnet IoT mendominasi di Indonesia; pada paruh pertama tahun 2025, tercatat total 133,4 juta serangan.</w:t>
       </w:r>
       <w:r/>
-      <w:r/>
     </w:p>
     <w:p>
       <w:pPr>
@@ -3911,20 +3958,35 @@
       <w:r>
         <w:t xml:space="preserve">erangan Man-in-the-Middle adalah tindakan menyadap komunikasi antara dua pihak yang sah untuk mencuri, memanipulasi, atau menyisipkan data tanpa sepengetahuan perangkat pengguna.</w:t>
       </w:r>
-      <w:r/>
-    </w:p>
-    <w:p>
-      <w:pPr>
-        <w:pBdr/>
-        <w:spacing/>
-        <w:ind w:right="0" w:firstLine="720" w:left="1440"/>
-        <w:rPr/>
-      </w:pPr>
       <w:r>
         <w:rPr>
           <w:highlight w:val="none"/>
         </w:rPr>
-        <w:t xml:space="preserve">Serangan Man-in-the-Middle memiliki dua tipe yaitu spoofing dan sniffing. Spoofing bekerja dengan mencuri identitas lain seperti spoofing IP, DNS, email, url web, dan lain-lain sehingga korban mengirimkan data kepada alamat palsu yag digunakan oleh penyerang, sedangkan Sniffing mengakses koneksi  korban dengan alamat asli dan membaca data yang ditransmisi.</w:t>
+      </w:r>
+      <w:r>
+        <w:rPr>
+          <w:highlight w:val="none"/>
+        </w:rPr>
+      </w:r>
+    </w:p>
+    <w:p>
+      <w:pPr>
+        <w:pBdr/>
+        <w:spacing/>
+        <w:ind w:right="0" w:firstLine="720" w:left="1440"/>
+        <w:rPr/>
+      </w:pPr>
+      <w:r>
+        <w:rPr>
+          <w:highlight w:val="none"/>
+        </w:rPr>
+        <w:t xml:space="preserve">Serangan Man-in-the-Middle memiliki dua tipe yaitu spoofing dan sniffing. Spoofing bekerja dengan mencu</w:t>
+      </w:r>
+      <w:r>
+        <w:rPr>
+          <w:highlight w:val="none"/>
+        </w:rPr>
+        <w:t xml:space="preserve">ri identitas lain seperti spoofing IP, DNS, email, url web, dan lain-lain sehingga korban mengirimkan data kepada alamat palsu yag digunakan oleh penyerang, sedangkan Sniffing mengakses koneksi  korban dengan alamat asli dan membaca data yang ditransmisi.</w:t>
         <w:tab/>
       </w:r>
       <w:r>
@@ -3932,6 +3994,7 @@
           <w:highlight w:val="none"/>
         </w:rPr>
       </w:r>
+      <w:r/>
     </w:p>
     <w:p>
       <w:pPr>
@@ -3959,7 +4022,6 @@
         <w:t xml:space="preserve">-Sign-On (SSO) universitas.</w:t>
       </w:r>
       <w:r/>
-      <w:r/>
     </w:p>
     <w:p>
       <w:pPr>
@@ -4023,24 +4085,89 @@
       <w:r/>
       <w:bookmarkStart w:id="15" w:name="_Toc15"/>
       <w:r>
-        <w:t xml:space="preserve">(Contoh Kasus XSS)</w:t>
+        <w:t xml:space="preserve">Whatsapp Web (2019)</w:t>
       </w:r>
       <w:r>
         <w:rPr>
           <w14:ligatures w14:val="none"/>
         </w:rPr>
       </w:r>
-      <w:bookmarkEnd w:id="15"/>
+    </w:p>
+    <w:p>
+      <w:pPr>
+        <w:pBdr/>
+        <w:spacing/>
+        <w:ind w:right="0" w:firstLine="720" w:left="1440"/>
+        <w:rPr/>
+      </w:pPr>
       <w:r>
-        <w:rPr>
-          <w14:ligatures w14:val="none"/>
-        </w:rPr>
+        <w:t xml:space="preserve">Pada tahun 2019, seorang peneliti cybersecurity PerimeterX bernama Gal Weizman menemukan sebuah kerentanan tingkat tinggi pada WhatsApp Web. </w:t>
+      </w:r>
+      <w:r/>
+      <w:r/>
+      <w:r/>
+      <w:r>
+        <w:t xml:space="preserve">Weizman  mengungkapkan bahwa, WhatsApp Web menjadi rentan terhadap celah pada Open-Redirect yang bisa memicu serangan XSS secara terus-menerus.</w:t>
+      </w:r>
+      <w:r/>
+      <w:r/>
+      <w:r/>
+      <w:r/>
+      <w:r/>
+    </w:p>
+    <w:p>
+      <w:pPr>
+        <w:pBdr/>
+        <w:spacing/>
+        <w:ind w:right="0" w:firstLine="720" w:left="1440"/>
+        <w:rPr/>
+      </w:pPr>
+      <w:r>
+        <w:t xml:space="preserve">serangan tersebut dapat dipicu dengan mengirimkan pesan yang "dirancang khusus" kepada target. </w:t>
+      </w:r>
+      <w:r/>
+      <w:r>
+        <w:t xml:space="preserve">jika target kurang waspada membuka pesan yang "dirancang khusus" tersebut pada browser, maka attacker bisa menjalankan "arbitrary code" dalam konteks domain whatsapp web. Namun, jika menggunakan desktop application maka attacker bisa menjalankan "malicious </w:t>
+      </w:r>
+      <w:r>
+        <w:t xml:space="preserve">code" pada sistem target jika target memiliki sistem komputer yang rentan dan tingkat keamanan yang rendah.</w:t>
+      </w:r>
+      <w:r/>
+      <w:r/>
+      <w:r/>
+      <w:r/>
+      <w:r/>
+    </w:p>
+    <w:p>
+      <w:pPr>
+        <w:pBdr/>
+        <w:spacing/>
+        <w:ind w:right="0" w:firstLine="720" w:left="1440"/>
+        <w:rPr/>
+      </w:pPr>
+      <w:r>
+        <w:t xml:space="preserve">Selain itu, </w:t>
+      </w:r>
+      <w:r>
+        <w:t xml:space="preserve">konfigurasi</w:t>
+      </w:r>
+      <w:r>
+        <w:t xml:space="preserve"> content security policy (CSP) yang salah pada WhatsApp web domain juga  memungkinkan Weizman untuk memuat payloads XSS dengan panjang tanpa batasan karakter dengan memakai iframe dari website terpisah yang dikontrol oleh attacker. </w:t>
+      </w:r>
+      <w:r>
+        <w:t xml:space="preserve">Weizman mengatakan, jika CSP dikonfigurasi dengan benar maka dampak serangan XSS akan lebih kecil karena dengan konfigurasi CSP yang tidak benar yang memungkinkan attacker mencuri informasi berharga dari target. </w:t>
+      </w:r>
+      <w:r>
+        <w:t xml:space="preserve">Celah pada open-redirect juga bisa dimanfaatkan untuk memanipulasi URL seraya dengan preview domain yang ditampilkan untuk membujuk target agar terjebak ke dalam serangan phising.</w:t>
       </w:r>
       <w:r>
         <w:rPr>
           <w14:ligatures w14:val="none"/>
         </w:rPr>
       </w:r>
+      <w:r/>
+      <w:r/>
+      <w:r/>
     </w:p>
     <w:p>
       <w:pPr>
@@ -4083,9 +4210,81 @@
       <w:r/>
       <w:bookmarkStart w:id="17" w:name="_Toc17"/>
       <w:r>
-        <w:t xml:space="preserve">(Contoh Kasus SQL Injection)</w:t>
+        <w:t xml:space="preserve">Ghostshell SQL Injection (2012)</w:t>
       </w:r>
-      <w:bookmarkEnd w:id="17"/>
+      <w:r/>
+    </w:p>
+    <w:p>
+      <w:pPr>
+        <w:pBdr/>
+        <w:spacing/>
+        <w:ind w:right="0" w:firstLine="720" w:left="1440"/>
+        <w:rPr/>
+      </w:pPr>
+      <w:r>
+        <w:t xml:space="preserve">Pada juli 2012, sebuah group hacker yang bernama "GhostShell" melancarkan serangan yang menargetkan berbagai agensi pemerintahan, universitas dan agensi-agensi terkenal seperti NASA, European Space Agency, The Fed (The Federal Reserve). </w:t>
+      </w:r>
+      <w:r/>
+      <w:r>
+        <w:t xml:space="preserve">Serangan dari GhostShell menggunakan SQL Injection yang mana SQL Injection ini memanfaatkan kerentanan pada Web App yang tidak memvalidasi user input dengan baik.</w:t>
+      </w:r>
+      <w:r/>
+      <w:r/>
+    </w:p>
+    <w:p>
+      <w:pPr>
+        <w:pBdr/>
+        <w:spacing/>
+        <w:ind w:right="0" w:firstLine="720" w:left="1440"/>
+        <w:rPr/>
+      </w:pPr>
+      <w:r>
+        <w:t xml:space="preserve">Para penyerang ini menggunakan sebuah tool yang disebut "Havij" untuk melakukan scan website yang rentan terhadap serangan pada Database SQL. Havij memang sebuah tools yang sering digunakan oleh para hacker untuk mengotomasi serangan SQL Injection. Apabila </w:t>
+      </w:r>
+      <w:r>
+        <w:t xml:space="preserve">Havji mengidentifikasi adanya kerentanan terhadap website, maka ia akan berusaha untuk "inject" atau menyisipkan SQL Statement yang berbahaya ke dalam input field pada web app.</w:t>
+      </w:r>
+      <w:r/>
+    </w:p>
+    <w:p>
+      <w:pPr>
+        <w:pBdr/>
+        <w:spacing/>
+        <w:ind w:right="0" w:firstLine="720" w:left="1440"/>
+        <w:rPr/>
+      </w:pPr>
+      <w:r>
+        <w:t xml:space="preserve">Para penyerang pada akhirnya berhasil melakukan extract sensitive data, seperti usernames, passwords, email addresses dari database yang diretas.</w:t>
+      </w:r>
+      <w:r/>
+    </w:p>
+    <w:p>
+      <w:pPr>
+        <w:pBdr/>
+        <w:spacing/>
+        <w:ind w:right="0" w:firstLine="720" w:left="1440"/>
+        <w:rPr/>
+      </w:pPr>
+      <w:r>
+        <w:t xml:space="preserve">The GhostShell attack mempunyai impact yang signifikan terhadap organisasi yang ditargetkan, banyak konsenkuensi dari sisi para user dan organisasi yang mana serangan ini dapat dimanfaatkan untuk mendapatkan akses tanpa izin ke sistem dan jaringan diluar li</w:t>
+      </w:r>
+      <w:r>
+        <w:t xml:space="preserve">ngkup database. Hal ini menyoroti bahwa pentingnya bagi organisasi untuk memastikan bahwa web app mereka telah diamankan dan diverifikasi dengan baik dengan validasi input untuk dapat mengakses query berparameter demi mencegah SQL Injection attack.</w:t>
+      </w:r>
+      <w:r/>
+    </w:p>
+    <w:p>
+      <w:pPr>
+        <w:pBdr/>
+        <w:spacing/>
+        <w:ind w:right="0" w:firstLine="720" w:left="1440"/>
+        <w:rPr/>
+      </w:pPr>
+      <w:r>
+        <w:t xml:space="preserve">Audit Security dan Pen test lah yang dapat membantu untuk mengidentifikasi keamanan untuk menangani dan mencegah sebelum celah tersebut dapat dimanfaatkan oleh si penyerang.</w:t>
+      </w:r>
+      <w:r/>
+      <w:r/>
       <w:r/>
       <w:r/>
     </w:p>
@@ -4104,9 +4303,48 @@
       <w:r/>
       <w:bookmarkStart w:id="18" w:name="_Toc18"/>
       <w:r>
-        <w:t xml:space="preserve">(Contoh Kasus DDoS)</w:t>
+        <w:t xml:space="preserve">Github (2018)</w:t>
       </w:r>
-      <w:bookmarkEnd w:id="18"/>
+      <w:r/>
+    </w:p>
+    <w:p>
+      <w:pPr>
+        <w:pBdr/>
+        <w:spacing/>
+        <w:ind w:right="0" w:firstLine="720" w:left="1440"/>
+        <w:rPr/>
+      </w:pPr>
+      <w:r/>
+      <w:r>
+        <w:t xml:space="preserve">Pada Februari 2018, platform pengembangan perangkat lunak GitHub mengalami salah satu serangan Distributed Denial of Service (DDoS) terbesar yang pernah tercatat pada saat itu. Serangan ini mencapai puncak lalu lintas sebesar sekitar 1.35 Terabits-per-secon</w:t>
+      </w:r>
+      <w:r>
+        <w:t xml:space="preserve">d (Tbps) dan memanfaatkan teknik Memcached Amplification. Teknik ini mengeksploitasi server memcached yang salah konfigurasi dan dapat diakses secara publik melalui protokol UDP. Penyerang mengirimkan permintaan kecil dengan alamat IP yang dipalsukan (IP sp</w:t>
+      </w:r>
+      <w:r>
+        <w:t xml:space="preserve">oofing), sehingga server memcached tersebut mengirimkan respons berukuran jauh lebih besar ke target, dalam hal ini GitHub. Rasio amplifikasi dari teknik ini dapat mencapai puluhan ribu kali lipat dari ukuran permintaan awal, yang mengakibatkan lonjakan tra</w:t>
+      </w:r>
+      <w:r>
+        <w:t xml:space="preserve">fik secara masif dan menyebabkan gangguan layanan pada situs GitHub selama beberapa menit. </w:t>
+      </w:r>
+      <w:r/>
+    </w:p>
+    <w:p>
+      <w:pPr>
+        <w:pBdr/>
+        <w:spacing/>
+        <w:ind w:right="0" w:firstLine="720" w:left="1440"/>
+        <w:rPr/>
+      </w:pPr>
+      <w:r>
+        <w:t xml:space="preserve">Untuk mengatasi serangan tersebut, GitHub bekerja sama dengan Akamai melalui layanan Prolexic guna melakukan traffic scrubbing dan mitigasi serangan secara cepat, seh</w:t>
+      </w:r>
+      <w:r>
+        <w:t xml:space="preserve">ingga layanan dapat dipulihkan dalam waktu relatif singkat. Kasus ini menyoroti pentingnya konfigurasi keamanan yang tepat pada layanan jaringan serta perlunya penerapan mekanisme mitigasi seperti rate limiting, network filtering, dan penggunaan infrastrukt</w:t>
+      </w:r>
+      <w:r>
+        <w:t xml:space="preserve">ur distribusi untuk meningkatkan ketahanan terhadap serangan DDoS berskala besar.</w:t>
+      </w:r>
       <w:r/>
       <w:r/>
     </w:p>
@@ -4124,12 +4362,191 @@
       </w:pPr>
       <w:r/>
       <w:bookmarkStart w:id="19" w:name="_Toc19"/>
+      <w:r/>
+      <w:bookmarkEnd w:id="19"/>
       <w:r>
-        <w:t xml:space="preserve">(Contoh Kasus Man in the Middle) </w:t>
+        <w:t xml:space="preserve">Salt Thypoon (2024)</w:t>
       </w:r>
-      <w:bookmarkEnd w:id="19"/>
       <w:r/>
+    </w:p>
+    <w:p>
+      <w:pPr>
+        <w:pBdr/>
+        <w:spacing/>
+        <w:ind w:right="0" w:firstLine="720" w:left="1440"/>
+        <w:rPr>
+          <w:highlight w:val="none"/>
+        </w:rPr>
+      </w:pPr>
+      <w:r>
+        <w:t xml:space="preserve">Salt</w:t>
+      </w:r>
+      <w:r>
+        <w:t xml:space="preserve"> Thypoon adalah group Advanced Persistant Threat (API) yang diduga berada dalam naungan Kementrian Keamanan Negara China yang menargetkan serangan utamnya pada Negera Amerika Serikat.</w:t>
+      </w:r>
       <w:r/>
+    </w:p>
+    <w:p>
+      <w:pPr>
+        <w:pBdr/>
+        <w:spacing/>
+        <w:ind w:right="0" w:firstLine="720" w:left="1440"/>
+        <w:rPr/>
+      </w:pPr>
+      <w:r>
+        <w:rPr>
+          <w:highlight w:val="none"/>
+        </w:rPr>
+        <w:t xml:space="preserve">Dasar prinsip MITM yang diterapkan Salt Typhoon diawali melalui pemanfaatan celah keamanan pada perangkat tepi jaringan, seperti router Cisco, VPN Ivanti, dan firewall Palo Alto, yang membuka pintu akses ke sistem korban. Selanjutnya, pelaku mengubah pengat</w:t>
+      </w:r>
+      <w:r>
+        <w:rPr>
+          <w:highlight w:val="none"/>
+        </w:rPr>
+        <w:t xml:space="preserve">uran perangkat tersebut agar mengalihkan arus data melalui server pengendali mereka, sehingga menciptakan penyamaran koneksi langsung sementara data sebenarnya dipantau secara penuh.</w:t>
+      </w:r>
+      <w:r/>
+    </w:p>
+    <w:p>
+      <w:pPr>
+        <w:pBdr/>
+        <w:spacing/>
+        <w:ind w:right="0" w:firstLine="720" w:left="1440"/>
+        <w:rPr/>
+      </w:pPr>
+      <w:r>
+        <w:rPr>
+          <w:highlight w:val="none"/>
+        </w:rPr>
+        <w:t xml:space="preserve">Pendekatan "living-off-the-land" menjadi elemen krusial dalam eksekusi MITM oleh Salt Typhoon, di mana alat sistem bawaan seperti PowerShell dan WMI dimanfaatkan untuk pergerakan lateral tanpa meninggalkan jejak malware konvensional. Strategi ini memfasilit</w:t>
+      </w:r>
+      <w:r>
+        <w:rPr>
+          <w:highlight w:val="none"/>
+        </w:rPr>
+        <w:t xml:space="preserve">asi pemantauan berkepanjangan selama berbulan-bulan, dengan data korban diteruskan ke tujuan semula secara normal sambil duplikatnya dikirimkan ke server command-and-control (C2) pelaku.</w:t>
+      </w:r>
+      <w:r/>
+    </w:p>
+    <w:p>
+      <w:pPr>
+        <w:pBdr/>
+        <w:spacing/>
+        <w:ind w:right="0" w:firstLine="720" w:left="1440"/>
+        <w:rPr/>
+      </w:pPr>
+      <w:r>
+        <w:rPr>
+          <w:highlight w:val="none"/>
+        </w:rPr>
+        <w:t xml:space="preserve">Pada tahun 2024, Salt Typhoon melancarkan operasi MITM berskala luas terhadap penyedia telekomunikasi Amerika seperti AT&amp;T, Verizon, T-Mobile, dan Lumen Technologies, dengan mengeksploitasi sistem penyadapan legal yang biasanya dipakai oleh otoritas pemerin</w:t>
+      </w:r>
+      <w:r>
+        <w:rPr>
+          <w:highlight w:val="none"/>
+        </w:rPr>
+        <w:t xml:space="preserve">tah untuk pengawasan sah. Kendali atas alur data ini memungkinkan mereka mengakses rekaman suara panggilan, pesan teks yang tidak terenkripsi, serta data lokasi dari jutaan pelanggan, termasuk kalangan pejabat senior.</w:t>
+      </w:r>
+      <w:r/>
+    </w:p>
+    <w:p>
+      <w:pPr>
+        <w:pBdr/>
+        <w:spacing/>
+        <w:ind w:right="0" w:firstLine="720" w:left="1440"/>
+        <w:rPr/>
+      </w:pPr>
+      <w:r>
+        <w:rPr>
+          <w:highlight w:val="none"/>
+        </w:rPr>
+        <w:t xml:space="preserve">Reperkusi dari operasi MITM Salt Typhoon merembet ke lebih dari 80 negara, termasuk Eropa melalui kelemahan Citrix NetScaler, di mana malware Snappybee disebarkan untuk memperluas jangkauan ke subnet internal. Di Amerika Serikat, infiltrasi ini mengkompromi</w:t>
+      </w:r>
+      <w:r>
+        <w:rPr>
+          <w:highlight w:val="none"/>
+        </w:rPr>
+        <w:t xml:space="preserve">kan komunikasi Presiden terpilih Donald Trump dan JD Vance, serta sekitar 1.400 dokumen konfigurasi dari 70 lembaga pemerintahan sejak 2023, yang berpotensi membentuk peta infrastruktur kritis untuk ancaman selanjutnya.</w:t>
+      </w:r>
+      <w:r/>
+    </w:p>
+    <w:p>
+      <w:pPr>
+        <w:pBdr/>
+        <w:spacing/>
+        <w:ind w:right="0" w:firstLine="720" w:left="1440"/>
+        <w:rPr/>
+      </w:pPr>
+      <w:r>
+        <w:rPr>
+          <w:highlight w:val="none"/>
+        </w:rPr>
+        <w:t xml:space="preserve">Salt Typhoon juga memanfaatkan layanan VPS seperti LightNode untuk mendukung infrastruktur C2 mereka, dengan pola lalu lintas khas berupa user-agent Internet Explorer dan URI spesifik (/17ABE7F017ABE7F0), yang memperlancar proses MITM secara senyap tanpa me</w:t>
+      </w:r>
+      <w:r>
+        <w:rPr>
+          <w:highlight w:val="none"/>
+        </w:rPr>
+        <w:t xml:space="preserve">ngganggu operasional korban. Karakteristik ini menyulitkan deteksi, karena pola lalu lintas tampak sah padahal dipantau secara langsung</w:t>
+      </w:r>
+      <w:r/>
+    </w:p>
+    <w:p>
+      <w:pPr>
+        <w:pBdr/>
+        <w:spacing/>
+        <w:ind w:right="0" w:firstLine="720" w:left="1440"/>
+        <w:rPr/>
+      </w:pPr>
+      <w:r>
+        <w:rPr>
+          <w:highlight w:val="none"/>
+        </w:rPr>
+        <w:t xml:space="preserve">Pada 2025, FBI mengklasifikasikan kampanye MITM Salt Typhoon sebagai ancaman darurat pertahanan nasional, dengan menerbitkan advisory yang mencantumkan indikator kompromi seperti modifikasi konfigurasi router. Serangan ini menyoroti kerapuhan infrastruktur </w:t>
+      </w:r>
+      <w:r>
+        <w:rPr>
+          <w:highlight w:val="none"/>
+        </w:rPr>
+        <w:t xml:space="preserve">telekomunikasi global, di mana pengupingan data politik dan militer Amerika berpotensi mengubah keseimbangan geopolitik.</w:t>
+      </w:r>
+      <w:r/>
+    </w:p>
+    <w:p>
+      <w:pPr>
+        <w:pBdr/>
+        <w:spacing/>
+        <w:ind w:right="0" w:firstLine="720" w:left="1440"/>
+        <w:rPr/>
+      </w:pPr>
+      <w:r>
+        <w:rPr>
+          <w:highlight w:val="none"/>
+        </w:rPr>
+        <w:t xml:space="preserve">Upaya mitigasi terhadap MITM seperti yang dilakukan Salt Typhoon menitikberatkan pada pembaruan cepat terhadap kerentanan CVE pada perangkat tepi, sebagaimana dianjurkan oleh CISA dan FBI. Lembaga disarankan untuk memantau arus keluar ke alamat IP mencuriga</w:t>
+      </w:r>
+      <w:r>
+        <w:rPr>
+          <w:highlight w:val="none"/>
+        </w:rPr>
+        <w:t xml:space="preserve">kan serta menerapkan segmentasi jaringan guna membatasi mobilitas pelaku.</w:t>
+      </w:r>
+      <w:r/>
+      <w:r>
+        <w:rPr>
+          <w:highlight w:val="none"/>
+        </w:rPr>
+      </w:r>
+      <w:r>
+        <w:rPr>
+          <w:highlight w:val="none"/>
+        </w:rPr>
+      </w:r>
+      <w:r>
+        <w:rPr>
+          <w:highlight w:val="none"/>
+        </w:rPr>
+      </w:r>
     </w:p>
     <w:p>
       <w:pPr>
@@ -4214,16 +4631,20 @@
         <w:rPr/>
       </w:pPr>
       <w:r>
-        <w:t xml:space="preserve">Beberapa langkah pencegahan yang efektif untuk menghindari serangan Social Engineering meliputi pelatihan berbasis gamifikasi untuk meningkatkan literasi keamanan siber, serta penerapan sistem penyaringan email berbasis kecerdasan buatan (AI) dengan tingkat deteksi 92% (telah diuji dan diverifikasi ole</w:t>
+        <w:t xml:space="preserve">Beberapa langkah pencegahan yang efektif untuk </w:t>
       </w:r>
       <w:r>
-        <w:t xml:space="preserve">h Universitas Telkom). Pedoman BSSN merekomendasikan penggunaan otentikasi dua faktor (2FA) dan prinsip hak akses minimal untuk memutus rantai serangan, namun tingkat penerimaannya di seluruh negeri masih di bawah 40%. Studi ini menunjukkan bahwa di kalanga</w:t>
+        <w:t xml:space="preserve">menghindari serangan Social Engineering meliputi pelatihan berbasis gamifikasi untuk meningkatkan literasi keamanan siber, serta penerapan sistem penyaringan email berbasis kecerdasan buatan (AI) dengan tingkat deteksi 92% (telah diuji dan diverifikasi ole</w:t>
+      </w:r>
+      <w:r>
+        <w:t xml:space="preserve">h</w:t>
+      </w:r>
+      <w:r>
+        <w:t xml:space="preserve"> Universitas Telkom). Pedoman BSSN merekomendasikan penggunaan otentikasi dua faktor (2FA) dan prinsip hak akses minimal untuk memutus rantai serangan, namun tingkat penerimaannya di seluruh negeri masih di bawah 40%. Studi ini menunjukkan bahwa di kalanga</w:t>
       </w:r>
       <w:r>
         <w:t xml:space="preserve">n akademisi Indonesia sangat dibutuhkan model prediksi berbasis pembelajaran mesin yang mengintegrasikan analisis perilaku untuk memungkinkan deteksi secara real-time.</w:t>
       </w:r>
-      <w:r/>
-      <w:r/>
       <w:r/>
     </w:p>
     <w:p>
@@ -4268,13 +4689,25 @@
         <w:rPr>
           <w:highlight w:val="none"/>
         </w:rPr>
-        <w:t xml:space="preserve">Prepared statements dengan parameter binding (PDO::prepare()) dan stored procedure terbukti telah memitigasi 95% vektor serangan dengan mengubah masukan menjadi nilai literal, bukan kode yang dapat dieksekusi. Unimma merekomendasikan Web Application Firewal</w:t>
+        <w:t xml:space="preserve">P</w:t>
       </w:r>
       <w:r>
         <w:rPr>
           <w:highlight w:val="none"/>
         </w:rPr>
-        <w:t xml:space="preserve">l (WAF) berbasis ekspresi reguler untuk deteksi tambahan terhadap tanda tangan SQLi dengan tingkat false positive sebesar 3,2%. Ada celah penelitian terkait kurangnya validasi masukan berbasis pembelajaran mesin yang kontekstual untuk mendeteksi teknik peny</w:t>
+        <w:t xml:space="preserve">repared statements dengan parameter binding (PDO::prepare()) dan stored procedure terbukti telah memitigasi 95% vektor serangan dengan mengubah masukan menjadi nilai literal, bukan kode yang dapat dieksekusi. Unimma merekomendasikan Web Application Firewal</w:t>
+      </w:r>
+      <w:r>
+        <w:rPr>
+          <w:highlight w:val="none"/>
+        </w:rPr>
+        <w:t xml:space="preserve">l</w:t>
+      </w:r>
+      <w:r>
+        <w:rPr>
+          <w:highlight w:val="none"/>
+        </w:rPr>
+        <w:t xml:space="preserve"> (WAF) berbasis ekspresi reguler untuk deteksi tambahan terhadap tanda tangan SQLi dengan tingkat false positive sebesar 3,2%. Ada celah penelitian terkait kurangnya validasi masukan berbasis pembelajaran mesin yang kontekstual untuk mendeteksi teknik peny</w:t>
       </w:r>
       <w:r>
         <w:rPr>
@@ -4288,7 +4721,6 @@
         </w:rPr>
       </w:r>
       <w:r/>
-      <w:r/>
     </w:p>
     <w:p>
       <w:pPr>
@@ -4326,7 +4758,13 @@
         <w:rPr>
           <w:highlight w:val="none"/>
         </w:rPr>
-        <w:t xml:space="preserve">Langkah-langkah pertahanan berlapis tersebut meliputi SYN-Cookies, pembatasan laju IP (iptables -A INPUT -p tcp --syn -m limit --limit 25/s --limit-burst 50 -j ACCEPT), serta rute BGP Anycast. Model jaringan saraf Unimed menggabungkan data NetFlow dengan pe</w:t>
+        <w:t xml:space="preserve">L</w:t>
+      </w:r>
+      <w:r>
+        <w:rPr>
+          <w:highlight w:val="none"/>
+        </w:rPr>
+        <w:t xml:space="preserve">angkah-langkah pertahanan berlapis tersebut meliputi SYN-Cookies, pembatasan laju IP (iptables -A INPUT -p tcp --syn -m limit --limit 25/s --limit-burst 50 -j ACCEPT), serta rute BGP Anycast. Model jaringan saraf Unimed menggabungkan data NetFlow dengan pe</w:t>
       </w:r>
       <w:r>
         <w:rPr>
@@ -4340,7 +4778,6 @@
         </w:rPr>
       </w:r>
       <w:r/>
-      <w:r/>
     </w:p>
     <w:p>
       <w:pPr>
@@ -4372,15 +4809,18 @@
         <w:ind w:right="0" w:firstLine="720" w:left="1440"/>
         <w:rPr/>
       </w:pPr>
-      <w:r/>
       <w:r>
-        <w:t xml:space="preserve">Langkah-langkah perlindungan komprehensif tersebut mencakup penggunaan HTTPS dengan dukungan HSTS, pengikatan sertifikat untuk aplikasi seluler, serta VPN yang selalu aktif untuk akses jarak jauh. Sesuai dengan pedoman NIST SP 800-207, area serangan dapat d</w:t>
+        <w:t xml:space="preserve">L</w:t>
       </w:r>
       <w:r>
-        <w:t xml:space="preserve">ikurangi sebesar 87% melalui penerapan akses jaringan Zero-Trust (ZTNA) dengan otentikasi berkelanjutan. BSSN merekomendasikan penggunaan WPA3-Enterprise bersama dengan server RADIUS mandiri dan segmentasi jaringan untuk mewujudkan VLAN IoT yang terisolasi.</w:t>
+        <w:t xml:space="preserve">angkah-langkah perlindungan komprehensif tersebut mencakup penggunaan HTTPS dengan dukungan HSTS, pengikatan sertifikat untuk aplikasi seluler, serta VPN yang selalu aktif untuk akses jarak jauh. Sesuai dengan pedoman NIST SP 800-207, area serangan dapat d</w:t>
       </w:r>
-      <w:r/>
-      <w:r/>
+      <w:r>
+        <w:t xml:space="preserve">i</w:t>
+      </w:r>
+      <w:r>
+        <w:t xml:space="preserve">kurangi sebesar 87% melalui penerapan akses jaringan Zero-Trust (ZTNA) dengan otentikasi berkelanjutan. BSSN merekomendasikan penggunaan WPA3-Enterprise bersama dengan server RADIUS mandiri dan segmentasi jaringan untuk mewujudkan VLAN IoT yang terisolasi.</w:t>
+      </w:r>
       <w:r/>
     </w:p>
     <w:p>

</xml_diff>